<commit_message>
feat: complete commenting system with User/Post relationships (Week 5)
</commit_message>
<xml_diff>
--- a/Word Blogging platform - for merge.docx
+++ b/Word Blogging platform - for merge.docx
@@ -191,10 +191,10 @@
         </w:rPr>
         <w:lastRenderedPageBreak/>
         <w:drawing>
-          <wp:inline distT="0" distB="0" distL="0" distR="0" wp14:anchorId="376EF969" wp14:editId="6BC1FD1A">
+          <wp:inline distT="0" distB="0" distL="0" distR="0" wp14:anchorId="44E2EBBF" wp14:editId="15136BBE">
             <wp:extent cx="5943600" cy="3341370"/>
             <wp:effectExtent l="0" t="0" r="0" b="0"/>
-            <wp:docPr id="5" name="Picture 5"/>
+            <wp:docPr id="6" name="Picture 6"/>
             <wp:cNvGraphicFramePr>
               <a:graphicFrameLocks xmlns:a="http://schemas.openxmlformats.org/drawingml/2006/main" noChangeAspect="1"/>
             </wp:cNvGraphicFramePr>
@@ -228,6 +228,49 @@
       </w:r>
       <w:bookmarkStart w:id="0" w:name="_GoBack"/>
       <w:bookmarkEnd w:id="0"/>
+    </w:p>
+    <w:p>
+      <w:r>
+        <w:rPr>
+          <w:noProof/>
+          <w:lang w:bidi="hi-IN"/>
+        </w:rPr>
+        <w:drawing>
+          <wp:inline distT="0" distB="0" distL="0" distR="0" wp14:anchorId="376EF969" wp14:editId="6BC1FD1A">
+            <wp:extent cx="5943600" cy="3341370"/>
+            <wp:effectExtent l="0" t="0" r="0" b="0"/>
+            <wp:docPr id="5" name="Picture 5"/>
+            <wp:cNvGraphicFramePr>
+              <a:graphicFrameLocks xmlns:a="http://schemas.openxmlformats.org/drawingml/2006/main" noChangeAspect="1"/>
+            </wp:cNvGraphicFramePr>
+            <a:graphic xmlns:a="http://schemas.openxmlformats.org/drawingml/2006/main">
+              <a:graphicData uri="http://schemas.openxmlformats.org/drawingml/2006/picture">
+                <pic:pic xmlns:pic="http://schemas.openxmlformats.org/drawingml/2006/picture">
+                  <pic:nvPicPr>
+                    <pic:cNvPr id="0" name=""/>
+                    <pic:cNvPicPr/>
+                  </pic:nvPicPr>
+                  <pic:blipFill>
+                    <a:blip r:embed="rId10"/>
+                    <a:stretch>
+                      <a:fillRect/>
+                    </a:stretch>
+                  </pic:blipFill>
+                  <pic:spPr>
+                    <a:xfrm>
+                      <a:off x="0" y="0"/>
+                      <a:ext cx="5943600" cy="3341370"/>
+                    </a:xfrm>
+                    <a:prstGeom prst="rect">
+                      <a:avLst/>
+                    </a:prstGeom>
+                  </pic:spPr>
+                </pic:pic>
+              </a:graphicData>
+            </a:graphic>
+          </wp:inline>
+        </w:drawing>
+      </w:r>
     </w:p>
     <w:sectPr>
       <w:pgSz w:w="12240" w:h="15840"/>

</xml_diff>

<commit_message>
Complete Week 6: Implemented tagging system, search functionality, and sidebar filtering
</commit_message>
<xml_diff>
--- a/Word Blogging platform - for merge.docx
+++ b/Word Blogging platform - for merge.docx
@@ -226,8 +226,6 @@
           </wp:inline>
         </w:drawing>
       </w:r>
-      <w:bookmarkStart w:id="0" w:name="_GoBack"/>
-      <w:bookmarkEnd w:id="0"/>
     </w:p>
     <w:p>
       <w:r>
@@ -271,6 +269,236 @@
           </wp:inline>
         </w:drawing>
       </w:r>
+    </w:p>
+    <w:p>
+      <w:pPr>
+        <w:pStyle w:val="NormalWeb"/>
+        <w:shd w:val="clear" w:color="auto" w:fill="FFFFFF"/>
+        <w:spacing w:before="0" w:beforeAutospacing="0" w:after="0" w:afterAutospacing="0"/>
+        <w:rPr>
+          <w:rFonts w:ascii="Arial" w:hAnsi="Arial" w:cs="Arial"/>
+          <w:color w:val="1F1F1F"/>
+        </w:rPr>
+      </w:pPr>
+      <w:r>
+        <w:rPr>
+          <w:rFonts w:ascii="Arial" w:hAnsi="Arial" w:cs="Arial"/>
+          <w:color w:val="1F1F1F"/>
+        </w:rPr>
+        <w:t xml:space="preserve">Latest Posts is not clickable </w:t>
+      </w:r>
+      <w:proofErr w:type="gramStart"/>
+      <w:r>
+        <w:rPr>
+          <w:rFonts w:ascii="Arial" w:hAnsi="Arial" w:cs="Arial"/>
+          <w:color w:val="1F1F1F"/>
+        </w:rPr>
+        <w:t>yet ,</w:t>
+      </w:r>
+      <w:proofErr w:type="gramEnd"/>
+      <w:r>
+        <w:rPr>
+          <w:rFonts w:ascii="Arial" w:hAnsi="Arial" w:cs="Arial"/>
+          <w:color w:val="1F1F1F"/>
+        </w:rPr>
+        <w:t xml:space="preserve"> Python Posts</w:t>
+      </w:r>
+    </w:p>
+    <w:p>
+      <w:pPr>
+        <w:pStyle w:val="NormalWeb"/>
+        <w:shd w:val="clear" w:color="auto" w:fill="FFFFFF"/>
+        <w:spacing w:before="0" w:beforeAutospacing="0" w:after="0" w:afterAutospacing="0"/>
+        <w:rPr>
+          <w:rFonts w:ascii="Arial" w:hAnsi="Arial" w:cs="Arial"/>
+          <w:color w:val="1F1F1F"/>
+        </w:rPr>
+      </w:pPr>
+      <w:r>
+        <w:rPr>
+          <w:rFonts w:ascii="Arial" w:hAnsi="Arial" w:cs="Arial"/>
+          <w:color w:val="1F1F1F"/>
+        </w:rPr>
+        <w:t>Tutorials - for these when i click this when clicking python posts this error appears</w:t>
+      </w:r>
+    </w:p>
+    <w:p/>
+    <w:p/>
+    <w:p>
+      <w:r>
+        <w:rPr>
+          <w:noProof/>
+          <w:lang w:bidi="hi-IN"/>
+        </w:rPr>
+        <w:lastRenderedPageBreak/>
+        <w:drawing>
+          <wp:inline distT="0" distB="0" distL="0" distR="0" wp14:anchorId="1EB40AAA" wp14:editId="20AD7378">
+            <wp:extent cx="5943600" cy="3341370"/>
+            <wp:effectExtent l="0" t="0" r="0" b="0"/>
+            <wp:docPr id="7" name="Picture 7"/>
+            <wp:cNvGraphicFramePr>
+              <a:graphicFrameLocks xmlns:a="http://schemas.openxmlformats.org/drawingml/2006/main" noChangeAspect="1"/>
+            </wp:cNvGraphicFramePr>
+            <a:graphic xmlns:a="http://schemas.openxmlformats.org/drawingml/2006/main">
+              <a:graphicData uri="http://schemas.openxmlformats.org/drawingml/2006/picture">
+                <pic:pic xmlns:pic="http://schemas.openxmlformats.org/drawingml/2006/picture">
+                  <pic:nvPicPr>
+                    <pic:cNvPr id="0" name=""/>
+                    <pic:cNvPicPr/>
+                  </pic:nvPicPr>
+                  <pic:blipFill>
+                    <a:blip r:embed="rId11"/>
+                    <a:stretch>
+                      <a:fillRect/>
+                    </a:stretch>
+                  </pic:blipFill>
+                  <pic:spPr>
+                    <a:xfrm>
+                      <a:off x="0" y="0"/>
+                      <a:ext cx="5943600" cy="3341370"/>
+                    </a:xfrm>
+                    <a:prstGeom prst="rect">
+                      <a:avLst/>
+                    </a:prstGeom>
+                  </pic:spPr>
+                </pic:pic>
+              </a:graphicData>
+            </a:graphic>
+          </wp:inline>
+        </w:drawing>
+      </w:r>
+    </w:p>
+    <w:p>
+      <w:r>
+        <w:rPr>
+          <w:noProof/>
+          <w:lang w:bidi="hi-IN"/>
+        </w:rPr>
+        <w:drawing>
+          <wp:inline distT="0" distB="0" distL="0" distR="0" wp14:anchorId="523D64E1" wp14:editId="684471C9">
+            <wp:extent cx="5943600" cy="3341370"/>
+            <wp:effectExtent l="0" t="0" r="0" b="0"/>
+            <wp:docPr id="8" name="Picture 8"/>
+            <wp:cNvGraphicFramePr>
+              <a:graphicFrameLocks xmlns:a="http://schemas.openxmlformats.org/drawingml/2006/main" noChangeAspect="1"/>
+            </wp:cNvGraphicFramePr>
+            <a:graphic xmlns:a="http://schemas.openxmlformats.org/drawingml/2006/main">
+              <a:graphicData uri="http://schemas.openxmlformats.org/drawingml/2006/picture">
+                <pic:pic xmlns:pic="http://schemas.openxmlformats.org/drawingml/2006/picture">
+                  <pic:nvPicPr>
+                    <pic:cNvPr id="0" name=""/>
+                    <pic:cNvPicPr/>
+                  </pic:nvPicPr>
+                  <pic:blipFill>
+                    <a:blip r:embed="rId12"/>
+                    <a:stretch>
+                      <a:fillRect/>
+                    </a:stretch>
+                  </pic:blipFill>
+                  <pic:spPr>
+                    <a:xfrm>
+                      <a:off x="0" y="0"/>
+                      <a:ext cx="5943600" cy="3341370"/>
+                    </a:xfrm>
+                    <a:prstGeom prst="rect">
+                      <a:avLst/>
+                    </a:prstGeom>
+                  </pic:spPr>
+                </pic:pic>
+              </a:graphicData>
+            </a:graphic>
+          </wp:inline>
+        </w:drawing>
+      </w:r>
+    </w:p>
+    <w:p>
+      <w:r>
+        <w:rPr>
+          <w:noProof/>
+          <w:lang w:bidi="hi-IN"/>
+        </w:rPr>
+        <w:lastRenderedPageBreak/>
+        <w:drawing>
+          <wp:inline distT="0" distB="0" distL="0" distR="0" wp14:anchorId="24E41FD9" wp14:editId="382DC553">
+            <wp:extent cx="5943600" cy="3341370"/>
+            <wp:effectExtent l="0" t="0" r="0" b="0"/>
+            <wp:docPr id="9" name="Picture 9"/>
+            <wp:cNvGraphicFramePr>
+              <a:graphicFrameLocks xmlns:a="http://schemas.openxmlformats.org/drawingml/2006/main" noChangeAspect="1"/>
+            </wp:cNvGraphicFramePr>
+            <a:graphic xmlns:a="http://schemas.openxmlformats.org/drawingml/2006/main">
+              <a:graphicData uri="http://schemas.openxmlformats.org/drawingml/2006/picture">
+                <pic:pic xmlns:pic="http://schemas.openxmlformats.org/drawingml/2006/picture">
+                  <pic:nvPicPr>
+                    <pic:cNvPr id="0" name=""/>
+                    <pic:cNvPicPr/>
+                  </pic:nvPicPr>
+                  <pic:blipFill>
+                    <a:blip r:embed="rId13"/>
+                    <a:stretch>
+                      <a:fillRect/>
+                    </a:stretch>
+                  </pic:blipFill>
+                  <pic:spPr>
+                    <a:xfrm>
+                      <a:off x="0" y="0"/>
+                      <a:ext cx="5943600" cy="3341370"/>
+                    </a:xfrm>
+                    <a:prstGeom prst="rect">
+                      <a:avLst/>
+                    </a:prstGeom>
+                  </pic:spPr>
+                </pic:pic>
+              </a:graphicData>
+            </a:graphic>
+          </wp:inline>
+        </w:drawing>
+      </w:r>
+    </w:p>
+    <w:p>
+      <w:r>
+        <w:rPr>
+          <w:noProof/>
+          <w:lang w:bidi="hi-IN"/>
+        </w:rPr>
+        <w:drawing>
+          <wp:inline distT="0" distB="0" distL="0" distR="0" wp14:anchorId="115345F0" wp14:editId="44D81521">
+            <wp:extent cx="5943600" cy="3341370"/>
+            <wp:effectExtent l="0" t="0" r="0" b="0"/>
+            <wp:docPr id="10" name="Picture 10"/>
+            <wp:cNvGraphicFramePr>
+              <a:graphicFrameLocks xmlns:a="http://schemas.openxmlformats.org/drawingml/2006/main" noChangeAspect="1"/>
+            </wp:cNvGraphicFramePr>
+            <a:graphic xmlns:a="http://schemas.openxmlformats.org/drawingml/2006/main">
+              <a:graphicData uri="http://schemas.openxmlformats.org/drawingml/2006/picture">
+                <pic:pic xmlns:pic="http://schemas.openxmlformats.org/drawingml/2006/picture">
+                  <pic:nvPicPr>
+                    <pic:cNvPr id="0" name=""/>
+                    <pic:cNvPicPr/>
+                  </pic:nvPicPr>
+                  <pic:blipFill>
+                    <a:blip r:embed="rId14"/>
+                    <a:stretch>
+                      <a:fillRect/>
+                    </a:stretch>
+                  </pic:blipFill>
+                  <pic:spPr>
+                    <a:xfrm>
+                      <a:off x="0" y="0"/>
+                      <a:ext cx="5943600" cy="3341370"/>
+                    </a:xfrm>
+                    <a:prstGeom prst="rect">
+                      <a:avLst/>
+                    </a:prstGeom>
+                  </pic:spPr>
+                </pic:pic>
+              </a:graphicData>
+            </a:graphic>
+          </wp:inline>
+        </w:drawing>
+      </w:r>
+      <w:bookmarkStart w:id="0" w:name="_GoBack"/>
+      <w:bookmarkEnd w:id="0"/>
     </w:p>
     <w:sectPr>
       <w:pgSz w:w="12240" w:h="15840"/>
@@ -501,6 +729,23 @@
       <w:szCs w:val="14"/>
     </w:rPr>
   </w:style>
+  <w:style w:type="paragraph" w:styleId="NormalWeb">
+    <w:name w:val="Normal (Web)"/>
+    <w:basedOn w:val="Normal"/>
+    <w:uiPriority w:val="99"/>
+    <w:semiHidden/>
+    <w:unhideWhenUsed/>
+    <w:rsid w:val="00BF15A2"/>
+    <w:pPr>
+      <w:spacing w:before="100" w:beforeAutospacing="1" w:after="100" w:afterAutospacing="1" w:line="240" w:lineRule="auto"/>
+    </w:pPr>
+    <w:rPr>
+      <w:rFonts w:ascii="Times New Roman" w:eastAsia="Times New Roman" w:hAnsi="Times New Roman" w:cs="Times New Roman"/>
+      <w:sz w:val="24"/>
+      <w:szCs w:val="24"/>
+      <w:lang w:bidi="hi-IN"/>
+    </w:rPr>
+  </w:style>
 </w:styles>
 </file>
 
@@ -721,6 +966,23 @@
       <w:rFonts w:ascii="Tahoma" w:hAnsi="Tahoma" w:cs="Tahoma"/>
       <w:sz w:val="16"/>
       <w:szCs w:val="14"/>
+    </w:rPr>
+  </w:style>
+  <w:style w:type="paragraph" w:styleId="NormalWeb">
+    <w:name w:val="Normal (Web)"/>
+    <w:basedOn w:val="Normal"/>
+    <w:uiPriority w:val="99"/>
+    <w:semiHidden/>
+    <w:unhideWhenUsed/>
+    <w:rsid w:val="00BF15A2"/>
+    <w:pPr>
+      <w:spacing w:before="100" w:beforeAutospacing="1" w:after="100" w:afterAutospacing="1" w:line="240" w:lineRule="auto"/>
+    </w:pPr>
+    <w:rPr>
+      <w:rFonts w:ascii="Times New Roman" w:eastAsia="Times New Roman" w:hAnsi="Times New Roman" w:cs="Times New Roman"/>
+      <w:sz w:val="24"/>
+      <w:szCs w:val="24"/>
+      <w:lang w:bidi="hi-IN"/>
     </w:rPr>
   </w:style>
 </w:styles>

</xml_diff>